<commit_message>
Complete the course: add Week 12 (Double/Debiased ML); final QA pass
All 15 weeks now present and verified end-to-end:
- Fresh rebuild of every week's packet (.docx), deck (.pptx), notebook (.ipynb)
- validate.py: all 15 notebooks execute top-to-bottom (every assert passes)
- lint_decks.py + check_geometry.py: 0 overflow / 0 off-canvas warnings
- Regenerated instructor teaching guide with the real Week 12 section
- Assessments/: midterm (+key), capstone brief/template, teaching guide

Co-Authored-By: Claude Opus 4.8 <noreply@anthropic.com>
Claude-Session: https://claude.ai/code/session_012jACa3xvaCp9Yvx3Z8JvKT
</commit_message>
<xml_diff>
--- a/Causal_Inference_Course/Assessments/Instructor_Teaching_Guide.docx
+++ b/Causal_Inference_Course/Assessments/Instructor_Teaching_Guide.docx
@@ -5371,17 +5371,7 @@
           <w:color w:val="7F8694"/>
           <w:sz w:val="22"/>
         </w:rPr>
-        <w:t xml:space="preserve">Block IV — Modern methods &amp; application. </w:t>
-      </w:r>
-      <w:r>
-        <w:rPr>
-          <w:rFonts w:ascii="Calibri" w:hAnsi="Calibri"/>
-          <w:b w:val="0"/>
-          <w:i/>
-          <w:color w:val="7F8694"/>
-          <w:sz w:val="22"/>
-        </w:rPr>
-        <w:t>Content module in progress at time of writing — this section is written from the topic list (Neyman orthogonality, cross-fitting, the partially linear model, DML for the ATE, and the pitfalls).</w:t>
+        <w:t>Block IV — Modern methods &amp; application</w:t>
       </w:r>
     </w:p>
     <w:p>
@@ -5710,7 +5700,7 @@
           <w:color w:val="222732"/>
           <w:sz w:val="21"/>
         </w:rPr>
-        <w:t>Deliverable: Problem set + lab (per the in-progress module).</w:t>
+        <w:t>Deliverable: Concept Set 12; Lab 9: Double ML.</w:t>
       </w:r>
     </w:p>
     <w:p>

</xml_diff>